<commit_message>
Fraud arms audited; a seventh defect, and the strongest result in the record
The fraud bandwidth arm is the first to return the outright surrogate verdict:
median 1.66e-04 in normAP, six times below the reproducibility floor, all four
settings. Florez-Ablan et al. reproduced in this pipeline, in endpoint units,
with no labels used in the fit. Indicative at a sample of six; the full
per-family run is what would establish it.

Seventh defect: the selection check computed the inner-vs-test rank
correlation, printed -0.367, and passed under 'Selection auditable'. A
non-positive correlation means the criterion carries no information about what
it selects for. It now warns, with the sign as the boundary.

Week 5 record revised: section 13's open gap is closed, 25 predictions scored
with 20 held.

Author: Nagesh Jonnalagadda
Repository: https://github.com/jnchowdary/qml-benchmark-lab
</commit_message>
<xml_diff>
--- a/docs/week-05-report.docx
+++ b/docs/week-05-report.docx
@@ -45,7 +45,7 @@
         <w:t xml:space="preserve">5f27bc7</w:t>
       </w:r>
       <w:r>
-        <w:t xml:space="preserve"> and </w:t>
+        <w:t xml:space="preserve">, </w:t>
       </w:r>
       <w:r>
         <w:rPr>
@@ -56,7 +56,7 @@
         <w:t xml:space="preserve">e90409f</w:t>
       </w:r>
       <w:r>
-        <w:t xml:space="preserve">. 371 tests passing, 97% coverage on </w:t>
+        <w:t xml:space="preserve"> and </w:t>
       </w:r>
       <w:r>
         <w:rPr>
@@ -64,10 +64,31 @@
           <w:sz w:val="19"/>
           <w:szCs w:val="19"/>
         </w:rPr>
+        <w:t xml:space="preserve">8198a4e</w:t>
+      </w:r>
+      <w:r>
+        <w:t xml:space="preserve">. 373 tests passing, 97% coverage on </w:t>
+      </w:r>
+      <w:r>
+        <w:rPr>
+          <w:rFonts w:ascii="Consolas" w:cs="Consolas" w:eastAsia="Consolas" w:hAnsi="Consolas"/>
+          <w:sz w:val="19"/>
+          <w:szCs w:val="19"/>
+        </w:rPr>
         <w:t xml:space="preserve">src/qbench</w:t>
       </w:r>
       <w:r>
-        <w:t xml:space="preserve">.</w:t>
+        <w:t xml:space="preserve">. </w:t>
+      </w:r>
+      <w:r>
+        <w:rPr>
+          <w:b/>
+          <w:bCs/>
+        </w:rPr>
+        <w:t xml:space="preserve">Revised the same day</w:t>
+      </w:r>
+      <w:r>
+        <w:t xml:space="preserve">, after the fraud arms were audited with the hook. Section 13 listed that as an open gap and it is now closed; sections 4, 9, 10, 11 and 13 are updated, and the fraud bandwidth arm produced the strongest single result in this record.</w:t>
       </w:r>
     </w:p>
     <w:p>
@@ -578,6 +599,91 @@
       </w:r>
       <w:r>
         <w:t xml:space="preserve"> bandwidths, two of six sampled kernels fall below the floor, median 3.04e-03, range 0.00e+00 to 2.89e-02, and the check reports it as too close to call.</w:t>
+      </w:r>
+    </w:p>
+    <w:p>
+      <w:pPr>
+        <w:spacing w:after="140"/>
+        <w:jc w:val="left"/>
+      </w:pPr>
+      <w:r>
+        <w:rPr>
+          <w:b/>
+          <w:bCs/>
+        </w:rPr>
+        <w:t xml:space="preserve">Fraud, both arms, added on revision.</w:t>
+      </w:r>
+      <w:r>
+        <w:t xml:space="preserve"> The registered fraud arm reads too close to call: median 3.95e-03, one of six below the floor, range 6.54e-04 to 2.40e-02. That follows from both arms sitting at 0.966 average precision with 0.034 of headroom — a kernel with that little room to move has little room to separate from its surrogate.</w:t>
+      </w:r>
+    </w:p>
+    <w:p>
+      <w:pPr>
+        <w:spacing w:after="140"/>
+        <w:jc w:val="left"/>
+      </w:pPr>
+      <w:r>
+        <w:t xml:space="preserve">The fraud </w:t>
+      </w:r>
+      <w:r>
+        <w:rPr>
+          <w:b/>
+          <w:bCs/>
+        </w:rPr>
+        <w:t xml:space="preserve">bandwidth</w:t>
+      </w:r>
+      <w:r>
+        <w:t xml:space="preserve"> arm is the first arm in this project to return the outright verdict:</w:t>
+      </w:r>
+    </w:p>
+    <w:p>
+      <w:pPr>
+        <w:pBdr>
+          <w:left w:val="single" w:color="999999" w:sz="12" w:space="8"/>
+        </w:pBdr>
+        <w:spacing w:after="120" w:before="120"/>
+        <w:ind w:left="360"/>
+      </w:pPr>
+      <w:r>
+        <w:rPr>
+          <w:i/>
+          <w:iCs/>
+        </w:rPr>
+        <w:t xml:space="preserve">over 6 sampled kernels the median difference from a label-free RBF surrogate is </w:t>
+      </w:r>
+      <w:r>
+        <w:rPr>
+          <w:b/>
+          <w:bCs/>
+          <w:i/>
+          <w:iCs/>
+        </w:rPr>
+        <w:t xml:space="preserve">1.66e-04</w:t>
+      </w:r>
+      <w:r>
+        <w:rPr>
+          <w:i/>
+          <w:iCs/>
+        </w:rPr>
+        <w:t xml:space="preserve"> in normAP, below this pipeline's reproducibility floor of 1e-03, over 4 methods on 6 seeds. On this evidence the kernel is its surrogate and the comparison is classical-versus-classical.</w:t>
+      </w:r>
+    </w:p>
+    <w:p>
+      <w:pPr>
+        <w:spacing w:after="140"/>
+        <w:jc w:val="left"/>
+      </w:pPr>
+      <w:r>
+        <w:t xml:space="preserve">Six times below the floor, across all four settings. This is Flórez-Ablan, Roth and Schnabel (2025) reproduced inside this project's own pipeline, measured in endpoint units rather than kernel-space distance, with no labels used in fitting the surrogate. It is sampled and therefore indicative rather than established; the full per-family run is what would establish it.</w:t>
+      </w:r>
+    </w:p>
+    <w:p>
+      <w:pPr>
+        <w:spacing w:after="140"/>
+        <w:jc w:val="left"/>
+      </w:pPr>
+      <w:r>
+        <w:t xml:space="preserve">Conditioning on fraud reaches 1.1e+33 registered and 7.5e+26 tuned, worse than churn by thirteen orders and further evidence that nothing threshold-based was ever usable here.</w:t>
       </w:r>
     </w:p>
     <w:p>
@@ -3150,7 +3256,7 @@
         <w:jc w:val="left"/>
       </w:pPr>
       <w:r>
-        <w:t xml:space="preserve">Twenty-one explicit calls were written down before the runs that tested them, tagged Certain, Likely or Guessing. Sixteen held. Five failed:</w:t>
+        <w:t xml:space="preserve">Twenty-five explicit calls were written down before the runs that tested them, tagged Certain, Likely or Guessing. Twenty held. Five failed:</w:t>
       </w:r>
     </w:p>
     <w:p>
@@ -3252,6 +3358,15 @@
         <w:jc w:val="left"/>
       </w:pPr>
       <w:r>
+        <w:t xml:space="preserve">The four calls made about the fraud arms on revision all held, including the [Guessing] one: that fraud's bandwidth arm would land either at "too close to call" or at a genuine below-floor reading, and that the second would be the stronger claim. It was the second.</w:t>
+      </w:r>
+    </w:p>
+    <w:p>
+      <w:pPr>
+        <w:spacing w:after="140"/>
+        <w:jc w:val="left"/>
+      </w:pPr>
+      <w:r>
         <w:t xml:space="preserve">Failures one and two were useful: each exposed a defect. Failure three corrected a substantive claim about which arm the classicality collapse belongs to. Failures four and five cost two turns and produced nothing.</w:t>
       </w:r>
     </w:p>
@@ -3407,6 +3522,55 @@
     </w:p>
     <w:p>
       <w:pPr>
+        <w:spacing w:after="80"/>
+        <w:ind w:left="360" w:hanging="240"/>
+      </w:pPr>
+      <w:r>
+        <w:t xml:space="preserve">5.  </w:t>
+      </w:r>
+      <w:r>
+        <w:rPr>
+          <w:b/>
+          <w:bCs/>
+        </w:rPr>
+        <w:t xml:space="preserve">A number computed, printed and ignored</w:t>
+      </w:r>
+      <w:r>
+        <w:t xml:space="preserve"> (found on revision). The </w:t>
+      </w:r>
+      <w:r>
+        <w:rPr>
+          <w:rFonts w:ascii="Consolas" w:cs="Consolas" w:eastAsia="Consolas" w:hAnsi="Consolas"/>
+          <w:sz w:val="19"/>
+          <w:szCs w:val="19"/>
+        </w:rPr>
+        <w:t xml:space="preserve">selection</w:t>
+      </w:r>
+      <w:r>
+        <w:t xml:space="preserve"> check</w:t>
+      </w:r>
+    </w:p>
+    <w:p>
+      <w:pPr>
+        <w:spacing w:after="140"/>
+        <w:jc w:val="left"/>
+      </w:pPr>
+      <w:r>
+        <w:t xml:space="preserve">measured the rank correlation between inner score and test score, printed it, and passed regardless. On the fraud bandwidth arm it printed </w:t>
+      </w:r>
+      <w:r>
+        <w:rPr>
+          <w:b/>
+          <w:bCs/>
+        </w:rPr>
+        <w:t xml:space="preserve">−0.367</w:t>
+      </w:r>
+      <w:r>
+        <w:t xml:space="preserve"> under the heading "Selection auditable". A non-positive correlation means the selection criterion carries no information about the quantity it selects for, which on that arm corroborates the surrogate verdict exactly: if every candidate is the same Gaussian kernel, inner-CV selection among them is ranking noise. The check now warns on a non-positive correlation. The boundary is the sign, not a chosen threshold. This is the same shape as defects three and four in section 5 — a measurement taken correctly and then not used — making it the third instance this week.</w:t>
+      </w:r>
+    </w:p>
+    <w:p>
+      <w:pPr>
         <w:spacing w:after="120" w:before="120"/>
       </w:pPr>
     </w:p>
@@ -3432,7 +3596,7 @@
         <w:jc w:val="left"/>
       </w:pPr>
       <w:r>
-        <w:t xml:space="preserve">371 tests, up from 357, all passing; coverage on </w:t>
+        <w:t xml:space="preserve">373 tests, up from 357, all passing; coverage on </w:t>
       </w:r>
       <w:r>
         <w:rPr>
@@ -3454,7 +3618,7 @@
         <w:t xml:space="preserve">tests/test_audit.py</w:t>
       </w:r>
       <w:r>
-        <w:t xml:space="preserve"> grew from 54 to 68 tests, fourteen of them regression tests for the six defects, each verified to fail against the version that shipped. Two pre-existing tests were rewritten because they asserted behaviour now known to be wrong.</w:t>
+        <w:t xml:space="preserve"> grew from 54 to 70 tests, fourteen of them regression tests for the six defects, each verified to fail against the version that shipped. Two pre-existing tests were rewritten because they asserted behaviour now known to be wrong.</w:t>
       </w:r>
     </w:p>
     <w:p>
@@ -3717,19 +3881,30 @@
           <w:b/>
           <w:bCs/>
         </w:rPr>
-        <w:t xml:space="preserve">The fraud arms have not been audited with the hook.</w:t>
-      </w:r>
-      <w:r>
-        <w:t xml:space="preserve"> Every conditioning and surrogate</w:t>
-      </w:r>
-    </w:p>
-    <w:p>
-      <w:pPr>
-        <w:spacing w:after="140"/>
-        <w:jc w:val="left"/>
-      </w:pPr>
-      <w:r>
-        <w:t xml:space="preserve">reading in this record is from churn. The sweep covers fraud for power, but the two kernel-level checks have not been run on it, and there is no reason to assume the readings transfer.</w:t>
+        <w:t xml:space="preserve">The fraud bandwidth arm's surrogate verdict is from a sample of six.</w:t>
+      </w:r>
+      <w:r>
+        <w:t xml:space="preserve"> It is the</w:t>
+      </w:r>
+    </w:p>
+    <w:p>
+      <w:pPr>
+        <w:spacing w:after="140"/>
+        <w:jc w:val="left"/>
+      </w:pPr>
+      <w:r>
+        <w:t xml:space="preserve">strongest result in this record and it rests on the smallest evidence in it. The full per-family run through </w:t>
+      </w:r>
+      <w:r>
+        <w:rPr>
+          <w:rFonts w:ascii="Consolas" w:cs="Consolas" w:eastAsia="Consolas" w:hAnsi="Consolas"/>
+          <w:sz w:val="19"/>
+          <w:szCs w:val="19"/>
+        </w:rPr>
+        <w:t xml:space="preserve">scripts/rbf_surrogate.py</w:t>
+      </w:r>
+      <w:r>
+        <w:t xml:space="preserve"> is what would establish it, and until that is done the verdict indicates rather than shows.</w:t>
       </w:r>
     </w:p>
     <w:p>
@@ -3866,7 +4041,27 @@
         <w:jc w:val="left"/>
       </w:pPr>
       <w:r>
-        <w:t xml:space="preserve">The protocol is now the deliverable and it has been exercised against real data exactly once, on one dataset, finding six defects in itself. The obvious next step is the second dataset, because the first found six.</w:t>
+        <w:t xml:space="preserve">The protocol is now the deliverable and it has been exercised against real data exactly once, on one dataset, finding six defects in itself. The second dataset was done on revision and found a seventh, in the </w:t>
+      </w:r>
+      <w:r>
+        <w:rPr>
+          <w:rFonts w:ascii="Consolas" w:cs="Consolas" w:eastAsia="Consolas" w:hAnsi="Consolas"/>
+          <w:sz w:val="19"/>
+          <w:szCs w:val="19"/>
+        </w:rPr>
+        <w:t xml:space="preserve">selection</w:t>
+      </w:r>
+      <w:r>
+        <w:t xml:space="preserve"> check.</w:t>
+      </w:r>
+    </w:p>
+    <w:p>
+      <w:pPr>
+        <w:spacing w:after="140"/>
+        <w:jc w:val="left"/>
+      </w:pPr>
+      <w:r>
+        <w:t xml:space="preserve">The next step is therefore the full per-family surrogate run on the fraud bandwidth arm, which is the one result in this record whose strength is out of proportion to its evidence.</w:t>
       </w:r>
     </w:p>
     <w:p>

</xml_diff>

<commit_message>
Fraud bandwidth arm: the surrogate finding established, not indicated
All four settings, twenty seeds each, three-condition rule. Every interval
spans zero; both families below D2's floor at +0.0002 and -0.0008. The rank
tests reject (angle p=0.0055) and the rule correctly refuses to call that an
effect.

80 of 80 fitted gammas fall inside 1e-3 to 1e2, the classical RBF grid the
baseline searched in week 2. The classical arm had already fitted kernels
indistinguishable from every tuned quantum kernel on this dataset, before the
quantum arm existed.

The audit's stratified six-sample median of 1.66e-04 agreed with the full
eighty-record analysis in direction and magnitude: first evidence that the
sampling fix produces readings worth acting on.

Author: Nagesh Jonnalagadda
Repository: https://github.com/jnchowdary/qml-benchmark-lab
</commit_message>
<xml_diff>
--- a/docs/week-05-report.docx
+++ b/docs/week-05-report.docx
@@ -85,10 +85,10 @@
           <w:b/>
           <w:bCs/>
         </w:rPr>
-        <w:t xml:space="preserve">Revised the same day</w:t>
-      </w:r>
-      <w:r>
-        <w:t xml:space="preserve">, after the fraud arms were audited with the hook. Section 13 listed that as an open gap and it is now closed; sections 4, 9, 10, 11 and 13 are updated, and the fraud bandwidth arm produced the strongest single result in this record.</w:t>
+        <w:t xml:space="preserve">Revised twice the same day</w:t>
+      </w:r>
+      <w:r>
+        <w:t xml:space="preserve">: after the fraud arms were audited with the hook, and again after the full per-family surrogate run on the fraud bandwidth arm established what the audit had only indicated. Section 13 listed that as an open gap and it is now closed; sections 4, 9, 10, 11 and 13 are updated, and the fraud bandwidth arm produced the strongest single result in this record.</w:t>
       </w:r>
     </w:p>
     <w:p>
@@ -674,7 +674,730 @@
         <w:jc w:val="left"/>
       </w:pPr>
       <w:r>
-        <w:t xml:space="preserve">Six times below the floor, across all four settings. This is Flórez-Ablan, Roth and Schnabel (2025) reproduced inside this project's own pipeline, measured in endpoint units rather than kernel-space distance, with no labels used in fitting the surrogate. It is sampled and therefore indicative rather than established; the full per-family run is what would establish it.</w:t>
+        <w:t xml:space="preserve">Six times below the floor, across all four settings. This is Flórez-Ablan, Roth and Schnabel (2025) reproduced inside this project's own pipeline, measured in endpoint units rather than kernel-space distance, with no labels used in fitting the surrogate. </w:t>
+      </w:r>
+      <w:r>
+        <w:rPr>
+          <w:b/>
+          <w:bCs/>
+        </w:rPr>
+        <w:t xml:space="preserve">The full per-family run, added on second revision, establishes it.</w:t>
+      </w:r>
+      <w:r>
+        <w:t xml:space="preserve"> All four settings, twenty seeds each, through </w:t>
+      </w:r>
+      <w:r>
+        <w:rPr>
+          <w:rFonts w:ascii="Consolas" w:cs="Consolas" w:eastAsia="Consolas" w:hAnsi="Consolas"/>
+          <w:sz w:val="19"/>
+          <w:szCs w:val="19"/>
+        </w:rPr>
+        <w:t xml:space="preserve">scripts/rbf_surrogate.py</w:t>
+      </w:r>
+      <w:r>
+        <w:t xml:space="preserve"> with the three-condition rule:</w:t>
+      </w:r>
+    </w:p>
+    <w:tbl>
+      <w:tblPr>
+        <w:tblW w:type="dxa" w:w="9360"/>
+        <w:tblBorders>
+          <w:top w:val="single" w:color="auto" w:sz="4"/>
+          <w:left w:val="single" w:color="auto" w:sz="4"/>
+          <w:bottom w:val="single" w:color="auto" w:sz="4"/>
+          <w:right w:val="single" w:color="auto" w:sz="4"/>
+          <w:insideH w:val="single" w:color="auto" w:sz="4"/>
+          <w:insideV w:val="single" w:color="auto" w:sz="4"/>
+        </w:tblBorders>
+      </w:tblPr>
+      <w:tblGrid>
+        <w:gridCol w:w="1872"/>
+        <w:gridCol w:w="1872"/>
+        <w:gridCol w:w="1872"/>
+        <w:gridCol w:w="1872"/>
+        <w:gridCol w:w="1872"/>
+      </w:tblGrid>
+      <w:tr>
+        <w:trPr>
+          <w:tblHeader/>
+        </w:trPr>
+        <w:tc>
+          <w:tcPr>
+            <w:tcW w:type="dxa" w:w="1872"/>
+            <w:shd w:fill="EDEDED" w:val="clear"/>
+            <w:tcMar>
+              <w:top w:type="dxa" w:w="60"/>
+              <w:left w:type="dxa" w:w="100"/>
+              <w:bottom w:type="dxa" w:w="60"/>
+              <w:right w:type="dxa" w:w="100"/>
+            </w:tcMar>
+          </w:tcPr>
+          <w:p>
+            <w:pPr>
+              <w:spacing w:after="0" w:before="0"/>
+            </w:pPr>
+            <w:r>
+              <w:rPr>
+                <w:b/>
+                <w:bCs/>
+                <w:sz w:val="19"/>
+                <w:szCs w:val="19"/>
+              </w:rPr>
+              <w:t xml:space="preserve">setting</w:t>
+            </w:r>
+          </w:p>
+        </w:tc>
+        <w:tc>
+          <w:tcPr>
+            <w:tcW w:type="dxa" w:w="1872"/>
+            <w:shd w:fill="EDEDED" w:val="clear"/>
+            <w:tcMar>
+              <w:top w:type="dxa" w:w="60"/>
+              <w:left w:type="dxa" w:w="100"/>
+              <w:bottom w:type="dxa" w:w="60"/>
+              <w:right w:type="dxa" w:w="100"/>
+            </w:tcMar>
+          </w:tcPr>
+          <w:p>
+            <w:pPr>
+              <w:spacing w:after="0" w:before="0"/>
+            </w:pPr>
+            <w:r>
+              <w:rPr>
+                <w:b/>
+                <w:bCs/>
+                <w:sz w:val="19"/>
+                <w:szCs w:val="19"/>
+              </w:rPr>
+              <w:t xml:space="preserve">median gamma</w:t>
+            </w:r>
+          </w:p>
+        </w:tc>
+        <w:tc>
+          <w:tcPr>
+            <w:tcW w:type="dxa" w:w="1872"/>
+            <w:shd w:fill="EDEDED" w:val="clear"/>
+            <w:tcMar>
+              <w:top w:type="dxa" w:w="60"/>
+              <w:left w:type="dxa" w:w="100"/>
+              <w:bottom w:type="dxa" w:w="60"/>
+              <w:right w:type="dxa" w:w="100"/>
+            </w:tcMar>
+          </w:tcPr>
+          <w:p>
+            <w:pPr>
+              <w:spacing w:after="0" w:before="0"/>
+            </w:pPr>
+            <w:r>
+              <w:rPr>
+                <w:b/>
+                <w:bCs/>
+                <w:sz w:val="19"/>
+                <w:szCs w:val="19"/>
+              </w:rPr>
+              <w:t xml:space="preserve">d normAP</w:t>
+            </w:r>
+          </w:p>
+        </w:tc>
+        <w:tc>
+          <w:tcPr>
+            <w:tcW w:type="dxa" w:w="1872"/>
+            <w:shd w:fill="EDEDED" w:val="clear"/>
+            <w:tcMar>
+              <w:top w:type="dxa" w:w="60"/>
+              <w:left w:type="dxa" w:w="100"/>
+              <w:bottom w:type="dxa" w:w="60"/>
+              <w:right w:type="dxa" w:w="100"/>
+            </w:tcMar>
+          </w:tcPr>
+          <w:p>
+            <w:pPr>
+              <w:spacing w:after="0" w:before="0"/>
+            </w:pPr>
+            <w:r>
+              <w:rPr>
+                <w:b/>
+                <w:bCs/>
+                <w:sz w:val="19"/>
+                <w:szCs w:val="19"/>
+              </w:rPr>
+              <w:t xml:space="preserve">95% CI</w:t>
+            </w:r>
+          </w:p>
+        </w:tc>
+        <w:tc>
+          <w:tcPr>
+            <w:tcW w:type="dxa" w:w="1872"/>
+            <w:shd w:fill="EDEDED" w:val="clear"/>
+            <w:tcMar>
+              <w:top w:type="dxa" w:w="60"/>
+              <w:left w:type="dxa" w:w="100"/>
+              <w:bottom w:type="dxa" w:w="60"/>
+              <w:right w:type="dxa" w:w="100"/>
+            </w:tcMar>
+          </w:tcPr>
+          <w:p>
+            <w:pPr>
+              <w:spacing w:after="0" w:before="0"/>
+            </w:pPr>
+            <w:r>
+              <w:rPr>
+                <w:b/>
+                <w:bCs/>
+                <w:sz w:val="19"/>
+                <w:szCs w:val="19"/>
+              </w:rPr>
+              <w:t xml:space="preserve">p</w:t>
+            </w:r>
+          </w:p>
+        </w:tc>
+      </w:tr>
+      <w:tr>
+        <w:tc>
+          <w:tcPr>
+            <w:tcW w:type="dxa" w:w="1872"/>
+            <w:tcMar>
+              <w:top w:type="dxa" w:w="60"/>
+              <w:left w:type="dxa" w:w="100"/>
+              <w:bottom w:type="dxa" w:w="60"/>
+              <w:right w:type="dxa" w:w="100"/>
+            </w:tcMar>
+          </w:tcPr>
+          <w:p>
+            <w:pPr>
+              <w:spacing w:after="0" w:before="0"/>
+            </w:pPr>
+            <w:r>
+              <w:rPr>
+                <w:b w:val="false"/>
+                <w:bCs w:val="false"/>
+                <w:sz w:val="19"/>
+                <w:szCs w:val="19"/>
+              </w:rPr>
+              <w:t xml:space="preserve">angle-r1</w:t>
+            </w:r>
+          </w:p>
+        </w:tc>
+        <w:tc>
+          <w:tcPr>
+            <w:tcW w:type="dxa" w:w="1872"/>
+            <w:tcMar>
+              <w:top w:type="dxa" w:w="60"/>
+              <w:left w:type="dxa" w:w="100"/>
+              <w:bottom w:type="dxa" w:w="60"/>
+              <w:right w:type="dxa" w:w="100"/>
+            </w:tcMar>
+          </w:tcPr>
+          <w:p>
+            <w:pPr>
+              <w:spacing w:after="0" w:before="0"/>
+            </w:pPr>
+            <w:r>
+              <w:rPr>
+                <w:b w:val="false"/>
+                <w:bCs w:val="false"/>
+                <w:sz w:val="19"/>
+                <w:szCs w:val="19"/>
+              </w:rPr>
+              <w:t xml:space="preserve">3.981e-03</w:t>
+            </w:r>
+          </w:p>
+        </w:tc>
+        <w:tc>
+          <w:tcPr>
+            <w:tcW w:type="dxa" w:w="1872"/>
+            <w:tcMar>
+              <w:top w:type="dxa" w:w="60"/>
+              <w:left w:type="dxa" w:w="100"/>
+              <w:bottom w:type="dxa" w:w="60"/>
+              <w:right w:type="dxa" w:w="100"/>
+            </w:tcMar>
+          </w:tcPr>
+          <w:p>
+            <w:pPr>
+              <w:spacing w:after="0" w:before="0"/>
+            </w:pPr>
+            <w:r>
+              <w:rPr>
+                <w:b w:val="false"/>
+                <w:bCs w:val="false"/>
+                <w:sz w:val="19"/>
+                <w:szCs w:val="19"/>
+              </w:rPr>
+              <w:t xml:space="preserve">+0.0003</w:t>
+            </w:r>
+          </w:p>
+        </w:tc>
+        <w:tc>
+          <w:tcPr>
+            <w:tcW w:type="dxa" w:w="1872"/>
+            <w:tcMar>
+              <w:top w:type="dxa" w:w="60"/>
+              <w:left w:type="dxa" w:w="100"/>
+              <w:bottom w:type="dxa" w:w="60"/>
+              <w:right w:type="dxa" w:w="100"/>
+            </w:tcMar>
+          </w:tcPr>
+          <w:p>
+            <w:pPr>
+              <w:spacing w:after="0" w:before="0"/>
+            </w:pPr>
+            <w:r>
+              <w:rPr>
+                <w:b w:val="false"/>
+                <w:bCs w:val="false"/>
+                <w:sz w:val="19"/>
+                <w:szCs w:val="19"/>
+              </w:rPr>
+              <w:t xml:space="preserve">−0.0008 to +0.0015</w:t>
+            </w:r>
+          </w:p>
+        </w:tc>
+        <w:tc>
+          <w:tcPr>
+            <w:tcW w:type="dxa" w:w="1872"/>
+            <w:tcMar>
+              <w:top w:type="dxa" w:w="60"/>
+              <w:left w:type="dxa" w:w="100"/>
+              <w:bottom w:type="dxa" w:w="60"/>
+              <w:right w:type="dxa" w:w="100"/>
+            </w:tcMar>
+          </w:tcPr>
+          <w:p>
+            <w:pPr>
+              <w:spacing w:after="0" w:before="0"/>
+            </w:pPr>
+            <w:r>
+              <w:rPr>
+                <w:b w:val="false"/>
+                <w:bCs w:val="false"/>
+                <w:sz w:val="19"/>
+                <w:szCs w:val="19"/>
+              </w:rPr>
+              <w:t xml:space="preserve">0.0353</w:t>
+            </w:r>
+          </w:p>
+        </w:tc>
+      </w:tr>
+      <w:tr>
+        <w:tc>
+          <w:tcPr>
+            <w:tcW w:type="dxa" w:w="1872"/>
+            <w:tcMar>
+              <w:top w:type="dxa" w:w="60"/>
+              <w:left w:type="dxa" w:w="100"/>
+              <w:bottom w:type="dxa" w:w="60"/>
+              <w:right w:type="dxa" w:w="100"/>
+            </w:tcMar>
+          </w:tcPr>
+          <w:p>
+            <w:pPr>
+              <w:spacing w:after="0" w:before="0"/>
+            </w:pPr>
+            <w:r>
+              <w:rPr>
+                <w:b w:val="false"/>
+                <w:bCs w:val="false"/>
+                <w:sz w:val="19"/>
+                <w:szCs w:val="19"/>
+              </w:rPr>
+              <w:t xml:space="preserve">angle-r2</w:t>
+            </w:r>
+          </w:p>
+        </w:tc>
+        <w:tc>
+          <w:tcPr>
+            <w:tcW w:type="dxa" w:w="1872"/>
+            <w:tcMar>
+              <w:top w:type="dxa" w:w="60"/>
+              <w:left w:type="dxa" w:w="100"/>
+              <w:bottom w:type="dxa" w:w="60"/>
+              <w:right w:type="dxa" w:w="100"/>
+            </w:tcMar>
+          </w:tcPr>
+          <w:p>
+            <w:pPr>
+              <w:spacing w:after="0" w:before="0"/>
+            </w:pPr>
+            <w:r>
+              <w:rPr>
+                <w:b w:val="false"/>
+                <w:bCs w:val="false"/>
+                <w:sz w:val="19"/>
+                <w:szCs w:val="19"/>
+              </w:rPr>
+              <w:t xml:space="preserve">1.585e-02</w:t>
+            </w:r>
+          </w:p>
+        </w:tc>
+        <w:tc>
+          <w:tcPr>
+            <w:tcW w:type="dxa" w:w="1872"/>
+            <w:tcMar>
+              <w:top w:type="dxa" w:w="60"/>
+              <w:left w:type="dxa" w:w="100"/>
+              <w:bottom w:type="dxa" w:w="60"/>
+              <w:right w:type="dxa" w:w="100"/>
+            </w:tcMar>
+          </w:tcPr>
+          <w:p>
+            <w:pPr>
+              <w:spacing w:after="0" w:before="0"/>
+            </w:pPr>
+            <w:r>
+              <w:rPr>
+                <w:b w:val="false"/>
+                <w:bCs w:val="false"/>
+                <w:sz w:val="19"/>
+                <w:szCs w:val="19"/>
+              </w:rPr>
+              <w:t xml:space="preserve">+0.0001</w:t>
+            </w:r>
+          </w:p>
+        </w:tc>
+        <w:tc>
+          <w:tcPr>
+            <w:tcW w:type="dxa" w:w="1872"/>
+            <w:tcMar>
+              <w:top w:type="dxa" w:w="60"/>
+              <w:left w:type="dxa" w:w="100"/>
+              <w:bottom w:type="dxa" w:w="60"/>
+              <w:right w:type="dxa" w:w="100"/>
+            </w:tcMar>
+          </w:tcPr>
+          <w:p>
+            <w:pPr>
+              <w:spacing w:after="0" w:before="0"/>
+            </w:pPr>
+            <w:r>
+              <w:rPr>
+                <w:b w:val="false"/>
+                <w:bCs w:val="false"/>
+                <w:sz w:val="19"/>
+                <w:szCs w:val="19"/>
+              </w:rPr>
+              <w:t xml:space="preserve">−0.0009 to +0.0010</w:t>
+            </w:r>
+          </w:p>
+        </w:tc>
+        <w:tc>
+          <w:tcPr>
+            <w:tcW w:type="dxa" w:w="1872"/>
+            <w:tcMar>
+              <w:top w:type="dxa" w:w="60"/>
+              <w:left w:type="dxa" w:w="100"/>
+              <w:bottom w:type="dxa" w:w="60"/>
+              <w:right w:type="dxa" w:w="100"/>
+            </w:tcMar>
+          </w:tcPr>
+          <w:p>
+            <w:pPr>
+              <w:spacing w:after="0" w:before="0"/>
+            </w:pPr>
+            <w:r>
+              <w:rPr>
+                <w:b w:val="false"/>
+                <w:bCs w:val="false"/>
+                <w:sz w:val="19"/>
+                <w:szCs w:val="19"/>
+              </w:rPr>
+              <w:t xml:space="preserve">0.0681</w:t>
+            </w:r>
+          </w:p>
+        </w:tc>
+      </w:tr>
+      <w:tr>
+        <w:tc>
+          <w:tcPr>
+            <w:tcW w:type="dxa" w:w="1872"/>
+            <w:tcMar>
+              <w:top w:type="dxa" w:w="60"/>
+              <w:left w:type="dxa" w:w="100"/>
+              <w:bottom w:type="dxa" w:w="60"/>
+              <w:right w:type="dxa" w:w="100"/>
+            </w:tcMar>
+          </w:tcPr>
+          <w:p>
+            <w:pPr>
+              <w:spacing w:after="0" w:before="0"/>
+            </w:pPr>
+            <w:r>
+              <w:rPr>
+                <w:b w:val="false"/>
+                <w:bCs w:val="false"/>
+                <w:sz w:val="19"/>
+                <w:szCs w:val="19"/>
+              </w:rPr>
+              <w:t xml:space="preserve">iqp-r1</w:t>
+            </w:r>
+          </w:p>
+        </w:tc>
+        <w:tc>
+          <w:tcPr>
+            <w:tcW w:type="dxa" w:w="1872"/>
+            <w:tcMar>
+              <w:top w:type="dxa" w:w="60"/>
+              <w:left w:type="dxa" w:w="100"/>
+              <w:bottom w:type="dxa" w:w="60"/>
+              <w:right w:type="dxa" w:w="100"/>
+            </w:tcMar>
+          </w:tcPr>
+          <w:p>
+            <w:pPr>
+              <w:spacing w:after="0" w:before="0"/>
+            </w:pPr>
+            <w:r>
+              <w:rPr>
+                <w:b w:val="false"/>
+                <w:bCs w:val="false"/>
+                <w:sz w:val="19"/>
+                <w:szCs w:val="19"/>
+              </w:rPr>
+              <w:t xml:space="preserve">5.623e-03</w:t>
+            </w:r>
+          </w:p>
+        </w:tc>
+        <w:tc>
+          <w:tcPr>
+            <w:tcW w:type="dxa" w:w="1872"/>
+            <w:tcMar>
+              <w:top w:type="dxa" w:w="60"/>
+              <w:left w:type="dxa" w:w="100"/>
+              <w:bottom w:type="dxa" w:w="60"/>
+              <w:right w:type="dxa" w:w="100"/>
+            </w:tcMar>
+          </w:tcPr>
+          <w:p>
+            <w:pPr>
+              <w:spacing w:after="0" w:before="0"/>
+            </w:pPr>
+            <w:r>
+              <w:rPr>
+                <w:b w:val="false"/>
+                <w:bCs w:val="false"/>
+                <w:sz w:val="19"/>
+                <w:szCs w:val="19"/>
+              </w:rPr>
+              <w:t xml:space="preserve">−0.0006</w:t>
+            </w:r>
+          </w:p>
+        </w:tc>
+        <w:tc>
+          <w:tcPr>
+            <w:tcW w:type="dxa" w:w="1872"/>
+            <w:tcMar>
+              <w:top w:type="dxa" w:w="60"/>
+              <w:left w:type="dxa" w:w="100"/>
+              <w:bottom w:type="dxa" w:w="60"/>
+              <w:right w:type="dxa" w:w="100"/>
+            </w:tcMar>
+          </w:tcPr>
+          <w:p>
+            <w:pPr>
+              <w:spacing w:after="0" w:before="0"/>
+            </w:pPr>
+            <w:r>
+              <w:rPr>
+                <w:b w:val="false"/>
+                <w:bCs w:val="false"/>
+                <w:sz w:val="19"/>
+                <w:szCs w:val="19"/>
+              </w:rPr>
+              <w:t xml:space="preserve">−0.0023 to +0.0011</w:t>
+            </w:r>
+          </w:p>
+        </w:tc>
+        <w:tc>
+          <w:tcPr>
+            <w:tcW w:type="dxa" w:w="1872"/>
+            <w:tcMar>
+              <w:top w:type="dxa" w:w="60"/>
+              <w:left w:type="dxa" w:w="100"/>
+              <w:bottom w:type="dxa" w:w="60"/>
+              <w:right w:type="dxa" w:w="100"/>
+            </w:tcMar>
+          </w:tcPr>
+          <w:p>
+            <w:pPr>
+              <w:spacing w:after="0" w:before="0"/>
+            </w:pPr>
+            <w:r>
+              <w:rPr>
+                <w:b w:val="false"/>
+                <w:bCs w:val="false"/>
+                <w:sz w:val="19"/>
+                <w:szCs w:val="19"/>
+              </w:rPr>
+              <w:t xml:space="preserve">0.0973</w:t>
+            </w:r>
+          </w:p>
+        </w:tc>
+      </w:tr>
+      <w:tr>
+        <w:tc>
+          <w:tcPr>
+            <w:tcW w:type="dxa" w:w="1872"/>
+            <w:tcMar>
+              <w:top w:type="dxa" w:w="60"/>
+              <w:left w:type="dxa" w:w="100"/>
+              <w:bottom w:type="dxa" w:w="60"/>
+              <w:right w:type="dxa" w:w="100"/>
+            </w:tcMar>
+          </w:tcPr>
+          <w:p>
+            <w:pPr>
+              <w:spacing w:after="0" w:before="0"/>
+            </w:pPr>
+            <w:r>
+              <w:rPr>
+                <w:b w:val="false"/>
+                <w:bCs w:val="false"/>
+                <w:sz w:val="19"/>
+                <w:szCs w:val="19"/>
+              </w:rPr>
+              <w:t xml:space="preserve">iqp-r2</w:t>
+            </w:r>
+          </w:p>
+        </w:tc>
+        <w:tc>
+          <w:tcPr>
+            <w:tcW w:type="dxa" w:w="1872"/>
+            <w:tcMar>
+              <w:top w:type="dxa" w:w="60"/>
+              <w:left w:type="dxa" w:w="100"/>
+              <w:bottom w:type="dxa" w:w="60"/>
+              <w:right w:type="dxa" w:w="100"/>
+            </w:tcMar>
+          </w:tcPr>
+          <w:p>
+            <w:pPr>
+              <w:spacing w:after="0" w:before="0"/>
+            </w:pPr>
+            <w:r>
+              <w:rPr>
+                <w:b w:val="false"/>
+                <w:bCs w:val="false"/>
+                <w:sz w:val="19"/>
+                <w:szCs w:val="19"/>
+              </w:rPr>
+              <w:t xml:space="preserve">6.310e-03</w:t>
+            </w:r>
+          </w:p>
+        </w:tc>
+        <w:tc>
+          <w:tcPr>
+            <w:tcW w:type="dxa" w:w="1872"/>
+            <w:tcMar>
+              <w:top w:type="dxa" w:w="60"/>
+              <w:left w:type="dxa" w:w="100"/>
+              <w:bottom w:type="dxa" w:w="60"/>
+              <w:right w:type="dxa" w:w="100"/>
+            </w:tcMar>
+          </w:tcPr>
+          <w:p>
+            <w:pPr>
+              <w:spacing w:after="0" w:before="0"/>
+            </w:pPr>
+            <w:r>
+              <w:rPr>
+                <w:b w:val="false"/>
+                <w:bCs w:val="false"/>
+                <w:sz w:val="19"/>
+                <w:szCs w:val="19"/>
+              </w:rPr>
+              <w:t xml:space="preserve">−0.0010</w:t>
+            </w:r>
+          </w:p>
+        </w:tc>
+        <w:tc>
+          <w:tcPr>
+            <w:tcW w:type="dxa" w:w="1872"/>
+            <w:tcMar>
+              <w:top w:type="dxa" w:w="60"/>
+              <w:left w:type="dxa" w:w="100"/>
+              <w:bottom w:type="dxa" w:w="60"/>
+              <w:right w:type="dxa" w:w="100"/>
+            </w:tcMar>
+          </w:tcPr>
+          <w:p>
+            <w:pPr>
+              <w:spacing w:after="0" w:before="0"/>
+            </w:pPr>
+            <w:r>
+              <w:rPr>
+                <w:b w:val="false"/>
+                <w:bCs w:val="false"/>
+                <w:sz w:val="19"/>
+                <w:szCs w:val="19"/>
+              </w:rPr>
+              <w:t xml:space="preserve">−0.0027 to +0.0008</w:t>
+            </w:r>
+          </w:p>
+        </w:tc>
+        <w:tc>
+          <w:tcPr>
+            <w:tcW w:type="dxa" w:w="1872"/>
+            <w:tcMar>
+              <w:top w:type="dxa" w:w="60"/>
+              <w:left w:type="dxa" w:w="100"/>
+              <w:bottom w:type="dxa" w:w="60"/>
+              <w:right w:type="dxa" w:w="100"/>
+            </w:tcMar>
+          </w:tcPr>
+          <w:p>
+            <w:pPr>
+              <w:spacing w:after="0" w:before="0"/>
+            </w:pPr>
+            <w:r>
+              <w:rPr>
+                <w:b w:val="false"/>
+                <w:bCs w:val="false"/>
+                <w:sz w:val="19"/>
+                <w:szCs w:val="19"/>
+              </w:rPr>
+              <w:t xml:space="preserve">0.0897</w:t>
+            </w:r>
+          </w:p>
+        </w:tc>
+      </w:tr>
+    </w:tbl>
+    <w:p>
+      <w:pPr>
+        <w:spacing w:after="160"/>
+      </w:pPr>
+    </w:p>
+    <w:p>
+      <w:pPr>
+        <w:spacing w:after="140"/>
+        <w:jc w:val="left"/>
+      </w:pPr>
+      <w:r>
+        <w:t xml:space="preserve">Every interval spans zero. Both families come in below D2's floor: angle at +0.0002 and IQP at −0.0008, neither a measurement. The rank tests do reject — angle at p = 0.0055 — and the three-condition rule refuses to call that an effect, which is the machinery built after week 4's "finding declared on noise" working as intended.</w:t>
+      </w:r>
+    </w:p>
+    <w:p>
+      <w:pPr>
+        <w:spacing w:after="140"/>
+        <w:jc w:val="left"/>
+      </w:pPr>
+      <w:r>
+        <w:rPr>
+          <w:b/>
+          <w:bCs/>
+        </w:rPr>
+        <w:t xml:space="preserve">80 of 80 fitted gammas fall inside 1e-03 to 1e+02, the classical RBF grid the baseline searched in week 2.</w:t>
+      </w:r>
+      <w:r>
+        <w:t xml:space="preserve"> These are not exotic kernels found post hoc to match. The classical arm had already fitted kernels functionally indistinguishable from every tuned quantum kernel on this dataset, before the quantum arm existed.</w:t>
+      </w:r>
+    </w:p>
+    <w:p>
+      <w:pPr>
+        <w:spacing w:after="140"/>
+        <w:jc w:val="left"/>
+      </w:pPr>
+      <w:r>
+        <w:t xml:space="preserve">The audit's six-sample median was 1.66e-04 against family effects of +0.0002 and −0.0008 from eighty records. The stratified sample agreed with the full run in direction and magnitude, which is the first evidence that the section 5 sampling fix produces readings worth acting on.</w:t>
       </w:r>
     </w:p>
     <w:p>
@@ -3881,19 +4604,16 @@
           <w:b/>
           <w:bCs/>
         </w:rPr>
-        <w:t xml:space="preserve">The fraud bandwidth arm's surrogate verdict is from a sample of six.</w:t>
-      </w:r>
-      <w:r>
-        <w:t xml:space="preserve"> It is the</w:t>
-      </w:r>
-    </w:p>
-    <w:p>
-      <w:pPr>
-        <w:spacing w:after="140"/>
-        <w:jc w:val="left"/>
-      </w:pPr>
-      <w:r>
-        <w:t xml:space="preserve">strongest result in this record and it rests on the smallest evidence in it. The full per-family run through </w:t>
+        <w:t xml:space="preserve">The churn bandwidth arm has not had the equivalent full run under the current code.</w:t>
+      </w:r>
+    </w:p>
+    <w:p>
+      <w:pPr>
+        <w:spacing w:after="140"/>
+        <w:jc w:val="left"/>
+      </w:pPr>
+      <w:r>
+        <w:t xml:space="preserve">Its per-family analysis was run in week 4, before four of this week's defects were known. None of the six touched </w:t>
       </w:r>
       <w:r>
         <w:rPr>
@@ -3904,7 +4624,7 @@
         <w:t xml:space="preserve">scripts/rbf_surrogate.py</w:t>
       </w:r>
       <w:r>
-        <w:t xml:space="preserve"> is what would establish it, and until that is done the verdict indicates rather than shows.</w:t>
+        <w:t xml:space="preserve">, so the figures should stand, but "should stand" is the reasoning this week has repeatedly punished.</w:t>
       </w:r>
     </w:p>
     <w:p>
@@ -4061,16 +4781,16 @@
         <w:jc w:val="left"/>
       </w:pPr>
       <w:r>
-        <w:t xml:space="preserve">The next step is therefore the full per-family surrogate run on the fraud bandwidth arm, which is the one result in this record whose strength is out of proportion to its evidence.</w:t>
-      </w:r>
-    </w:p>
-    <w:p>
-      <w:pPr>
-        <w:spacing w:after="140"/>
-        <w:jc w:val="left"/>
-      </w:pPr>
-      <w:r>
-        <w:t xml:space="preserve">After that, the section 1 rewrite, which is the last thing standing between this project and a registration that describes what it is actually doing.</w:t>
+        <w:t xml:space="preserve">That run was done on second revision and the finding held: on fraud at tuned bandwidths the quantum kernels are Gaussian kernels the classical baseline had already searched.</w:t>
+      </w:r>
+    </w:p>
+    <w:p>
+      <w:pPr>
+        <w:spacing w:after="140"/>
+        <w:jc w:val="left"/>
+      </w:pPr>
+      <w:r>
+        <w:t xml:space="preserve">The next step is the section 1 rewrite, which is the last thing standing between this project and a registration that describes what it is actually doing.</w:t>
       </w:r>
     </w:p>
     <w:p>

</xml_diff>

<commit_message>
Churn's tuned arm is an underpowered null, not fraud's result
Angle -0.0033 [-0.0076, +0.0010], IQP +0.0045 [-0.0036, +0.0126]. Neither
clears the three-condition rule, so neither is a detected effect. But both
point estimates are three to four times the precision floor: what fails is the
interval excluding zero, not the magnitude. Fraud's is a sub-floor identity at
+0.0002 and -0.0008. Reporting both as 'the kernel is its surrogate' would
state the weaker result at the strength of the stronger.

Sixth failed prediction of week 5: at least one churn family would clear the
floor. Both do clear the floor. The prediction conflated clearing the floor
with clearing all three conditions, in a project whose rule requires all three,
having built that rule.

Second dataset running, second time the audit's stratified sample called the
full-run magnitude: 3.04e-03 sampled against 0.0033 and 0.0045 measured.

Author: Nagesh Jonnalagadda
Repository: https://github.com/jnchowdary/qml-benchmark-lab
</commit_message>
<xml_diff>
--- a/docs/week-05-report.docx
+++ b/docs/week-05-report.docx
@@ -85,10 +85,10 @@
           <w:b/>
           <w:bCs/>
         </w:rPr>
-        <w:t xml:space="preserve">Revised twice the same day</w:t>
-      </w:r>
-      <w:r>
-        <w:t xml:space="preserve">: after the fraud arms were audited with the hook, and again after the full per-family surrogate run on the fraud bandwidth arm established what the audit had only indicated. Section 13 listed that as an open gap and it is now closed; sections 4, 9, 10, 11 and 13 are updated, and the fraud bandwidth arm produced the strongest single result in this record.</w:t>
+        <w:t xml:space="preserve">Revised three times</w:t>
+      </w:r>
+      <w:r>
+        <w:t xml:space="preserve">: after the fraud arms were audited with the hook, again after the full per-family surrogate run on the fraud bandwidth arm established what the audit had only indicated, and once more on 27 September after the churn equivalent came back a weaker result than fraud's rather than a matching one. Section 13 listed that as an open gap and it is now closed; sections 4, 9, 10, 11 and 13 are updated, and the fraud bandwidth arm produced the strongest single result in this record.</w:t>
       </w:r>
     </w:p>
     <w:p>
@@ -1397,6 +1397,32 @@
         <w:jc w:val="left"/>
       </w:pPr>
       <w:r>
+        <w:rPr>
+          <w:b/>
+          <w:bCs/>
+        </w:rPr>
+        <w:t xml:space="preserve">Churn does not reproduce this, and the difference is the point.</w:t>
+      </w:r>
+      <w:r>
+        <w:t xml:space="preserve"> Run under the same code, churn's tuned arm gives angle −0.0033 [−0.0076, +0.0010] and IQP +0.0045 [−0.0036, +0.0126]. Neither clears the three-condition rule, so neither is a detected effect — but both point estimates sit three to four times </w:t>
+      </w:r>
+      <w:r>
+        <w:rPr>
+          <w:i/>
+          <w:iCs/>
+        </w:rPr>
+        <w:t xml:space="preserve">above</w:t>
+      </w:r>
+      <w:r>
+        <w:t xml:space="preserve"> the precision floor, and what fails is the interval excluding zero, not the magnitude. That is an underpowered null. Fraud's is a sub-floor identity. Reporting both as "the kernel is its surrogate" would state the weaker result at the strength of the stronger one, which is the error D6 exists to prevent one level up. Churn's 80 of 80 gammas also fall inside the searched grid.</w:t>
+      </w:r>
+    </w:p>
+    <w:p>
+      <w:pPr>
+        <w:spacing w:after="140"/>
+        <w:jc w:val="left"/>
+      </w:pPr>
+      <w:r>
         <w:t xml:space="preserve">The audit's six-sample median was 1.66e-04 against family effects of +0.0002 and −0.0008 from eighty records. The stratified sample agreed with the full run in direction and magnitude, which is the first evidence that the section 5 sampling fix produces readings worth acting on.</w:t>
       </w:r>
     </w:p>
@@ -3979,7 +4005,7 @@
         <w:jc w:val="left"/>
       </w:pPr>
       <w:r>
-        <w:t xml:space="preserve">Twenty-five explicit calls were written down before the runs that tested them, tagged Certain, Likely or Guessing. Twenty held. Five failed:</w:t>
+        <w:t xml:space="preserve">Twenty-seven explicit calls were written down before the runs that tested them, tagged Certain, Likely or Guessing. Twenty-one held. Six failed:</w:t>
       </w:r>
     </w:p>
     <w:p>
@@ -4064,6 +4090,34 @@
       </w:pPr>
       <w:r>
         <w:t xml:space="preserve">equals the arm-level figure, which is the documented coincidence.</w:t>
+      </w:r>
+    </w:p>
+    <w:p>
+      <w:pPr>
+        <w:spacing w:after="80"/>
+        <w:ind w:left="360" w:hanging="240"/>
+      </w:pPr>
+      <w:r>
+        <w:t xml:space="preserve">6.  At least one churn family would clear the floor in the tuned arm. Neither did. The</w:t>
+      </w:r>
+    </w:p>
+    <w:p>
+      <w:pPr>
+        <w:spacing w:after="140"/>
+        <w:jc w:val="left"/>
+      </w:pPr>
+      <w:r>
+        <w:t xml:space="preserve">reasoning conflated "exceeds the precision floor" with "clears the three-condition rule": both point estimates </w:t>
+      </w:r>
+      <w:r>
+        <w:rPr>
+          <w:i/>
+          <w:iCs/>
+        </w:rPr>
+        <w:t xml:space="preserve">do</w:t>
+      </w:r>
+      <w:r>
+        <w:t xml:space="preserve"> exceed the floor, and what fails is the interval excluding zero. Predicting on one of three conditions, in a project whose own rule requires all three, having built that rule.</w:t>
       </w:r>
     </w:p>
     <w:p>
@@ -4604,27 +4658,19 @@
           <w:b/>
           <w:bCs/>
         </w:rPr>
-        <w:t xml:space="preserve">The churn bandwidth arm has not had the equivalent full run under the current code.</w:t>
-      </w:r>
-    </w:p>
-    <w:p>
-      <w:pPr>
-        <w:spacing w:after="140"/>
-        <w:jc w:val="left"/>
-      </w:pPr>
-      <w:r>
-        <w:t xml:space="preserve">Its per-family analysis was run in week 4, before four of this week's defects were known. None of the six touched </w:t>
-      </w:r>
-      <w:r>
-        <w:rPr>
-          <w:rFonts w:ascii="Consolas" w:cs="Consolas" w:eastAsia="Consolas" w:hAnsi="Consolas"/>
-          <w:sz w:val="19"/>
-          <w:szCs w:val="19"/>
-        </w:rPr>
-        <w:t xml:space="preserve">scripts/rbf_surrogate.py</w:t>
-      </w:r>
-      <w:r>
-        <w:t xml:space="preserve">, so the figures should stand, but "should stand" is the reasoning this week has repeatedly punished.</w:t>
+        <w:t xml:space="preserve">Churn's tuned arm is an underpowered null, not a demonstration of equivalence</w:t>
+      </w:r>
+      <w:r>
+        <w:t xml:space="preserve"> (added</w:t>
+      </w:r>
+    </w:p>
+    <w:p>
+      <w:pPr>
+        <w:spacing w:after="140"/>
+        <w:jc w:val="left"/>
+      </w:pPr>
+      <w:r>
+        <w:t xml:space="preserve">on third revision). Re-run under current code it gives angle −0.0033 [−0.0076, +0.0010] and IQP +0.0045 [−0.0036, +0.0126]: both point estimates three to four times the precision floor, both intervals spanning zero. It excludes an effect the size of the registered arm's +0.0852 and cannot exclude an effect the size of its own point estimate. Resolving it needs more seeds on that arm, not more analysis of these twenty.</w:t>
       </w:r>
     </w:p>
     <w:p>
@@ -4781,7 +4827,7 @@
         <w:jc w:val="left"/>
       </w:pPr>
       <w:r>
-        <w:t xml:space="preserve">That run was done on second revision and the finding held: on fraud at tuned bandwidths the quantum kernels are Gaussian kernels the classical baseline had already searched.</w:t>
+        <w:t xml:space="preserve">That run was done on second revision and the finding held on fraud: at tuned bandwidths the quantum kernels there are Gaussian kernels the classical baseline had already searched. The churn equivalent, run on third revision, is an underpowered null rather than the same result, and closing that gap needs seeds rather than analysis.</w:t>
       </w:r>
     </w:p>
     <w:p>

</xml_diff>